<commit_message>
v0.2.2-alpha — transactional reference.docx + output-pairing discipline
v0.2.1 wrongly applied pleading-style reference.docx to this transactional
plugin. v0.2.2 ships the correct transactional variant (TNR 12pt single-spaced,
no spaced section headers, no underline on headings) + pair_md_to_docx.sh
helper script that pairs every agent's .md output with a .docx.
</commit_message>
<xml_diff>
--- a/skills/_contract_drafting_base/reference.docx
+++ b/skills/_contract_drafting_base/reference.docx
@@ -7,20 +7,12 @@
         <w:pStyle w:val="Heading1"/>
       </w:pPr>
       <w:r>
-        <w:t>IN THE HIGH COURT OF JUDICATURE AT BOMBAY BENCH AT NAGPUR.</w:t>
-      </w:r>
-    </w:p>
-    <w:p>
-      <w:pPr>
-        <w:pStyle w:val="Heading1"/>
-      </w:pPr>
-      <w:r>
-        <w:t>WRIT PETITION NO. _______ OF 2026</w:t>
+        <w:t>THIS DEED OF [ASSIGNMENT/SALE/LEASE/etc.]</w:t>
       </w:r>
     </w:p>
     <w:p>
       <w:r>
-        <w:t>Style template — pandoc replaces this body. Normal style: TNR 14pt 1.5 spacing justified 0.5cm first-line indent.</w:t>
+        <w:t>(Transactional instrument — TNR 12pt single-spaced; this is a style template, pandoc replaces this content when rendering the actual document.)</w:t>
       </w:r>
     </w:p>
     <w:p>
@@ -28,12 +20,20 @@
         <w:pStyle w:val="Heading2"/>
       </w:pPr>
       <w:r>
-        <w:t>F A C T S</w:t>
+        <w:t>1. PARTIES</w:t>
       </w:r>
     </w:p>
     <w:p>
       <w:r>
-        <w:t>Body inside F A C T S section.</w:t>
+        <w:t>This Deed is executed on this ___ day of _____, 20___ by and between …</w:t>
+      </w:r>
+    </w:p>
+    <w:p>
+      <w:pPr>
+        <w:pStyle w:val="Heading2"/>
+      </w:pPr>
+      <w:r>
+        <w:t>2. DEFINITIONS</w:t>
       </w:r>
     </w:p>
     <w:p>
@@ -41,31 +41,18 @@
         <w:pStyle w:val="Heading3"/>
       </w:pPr>
       <w:r>
-        <w:t>ACTS &amp; RULES</w:t>
+        <w:t>2.1 Definitions</w:t>
       </w:r>
     </w:p>
     <w:p>
       <w:r>
-        <w:t>Indian Evidence Act 1872 / Civil Procedure Code 1908</w:t>
-      </w:r>
-    </w:p>
-    <w:p>
-      <w:pPr>
-        <w:pStyle w:val="Heading4"/>
-      </w:pPr>
-      <w:r>
-        <w:t>MOST RESPECTFULLY SHEWETH:</w:t>
-      </w:r>
-    </w:p>
-    <w:p>
-      <w:r>
-        <w:t>Body following Heading 4.</w:t>
+        <w:t>In this Deed, unless the context otherwise requires, the following terms shall have the meanings ascribed to them …</w:t>
       </w:r>
     </w:p>
     <w:sectPr>
-      <w:headerReference w:type="default" r:id="rId9"/>
+      <w:footerReference w:type="default" r:id="rId9"/>
       <w:pgSz w:w="11906" w:h="16838"/>
-      <w:pgMar w:top="1417" w:right="1417" w:bottom="1417" w:left="2268" w:header="720" w:footer="720" w:gutter="0"/>
+      <w:pgMar w:top="1417" w:right="1417" w:bottom="1417" w:left="1417" w:header="720" w:footer="720" w:gutter="0"/>
       <w:cols w:space="720"/>
       <w:docGrid w:linePitch="360"/>
     </w:sectPr>
@@ -73,24 +60,24 @@
 </w:document>
 </file>
 
-<file path=word/header1.xml><?xml version="1.0" encoding="utf-8"?>
-<w:hdr xmlns:m="http://schemas.openxmlformats.org/officeDocument/2006/math" xmlns:mc="http://schemas.openxmlformats.org/markup-compatibility/2006" xmlns:mo="http://schemas.microsoft.com/office/mac/office/2008/main" xmlns:mv="urn:schemas-microsoft-com:mac:vml" xmlns:o="urn:schemas-microsoft-com:office:office" xmlns:r="http://schemas.openxmlformats.org/officeDocument/2006/relationships" xmlns:v="urn:schemas-microsoft-com:vml" xmlns:w10="urn:schemas-microsoft-com:office:word" xmlns:w14="http://schemas.microsoft.com/office/word/2010/wordml" xmlns:w="http://schemas.openxmlformats.org/wordprocessingml/2006/main" xmlns:wne="http://schemas.microsoft.com/office/word/2006/wordml" xmlns:wp14="http://schemas.microsoft.com/office/word/2010/wordprocessingDrawing" xmlns:wp="http://schemas.openxmlformats.org/drawingml/2006/wordprocessingDrawing" xmlns:wpc="http://schemas.microsoft.com/office/word/2010/wordprocessingCanvas" xmlns:wpg="http://schemas.microsoft.com/office/word/2010/wordprocessingGroup" xmlns:wpi="http://schemas.microsoft.com/office/word/2010/wordprocessingInk" xmlns:wps="http://schemas.microsoft.com/office/word/2010/wordprocessingShape" mc:Ignorable="w14 wp14">
+<file path=word/footer1.xml><?xml version="1.0" encoding="utf-8"?>
+<w:ftr xmlns:m="http://schemas.openxmlformats.org/officeDocument/2006/math" xmlns:mc="http://schemas.openxmlformats.org/markup-compatibility/2006" xmlns:mo="http://schemas.microsoft.com/office/mac/office/2008/main" xmlns:mv="urn:schemas-microsoft-com:mac:vml" xmlns:o="urn:schemas-microsoft-com:office:office" xmlns:r="http://schemas.openxmlformats.org/officeDocument/2006/relationships" xmlns:v="urn:schemas-microsoft-com:vml" xmlns:w10="urn:schemas-microsoft-com:office:word" xmlns:w14="http://schemas.microsoft.com/office/word/2010/wordml" xmlns:w="http://schemas.openxmlformats.org/wordprocessingml/2006/main" xmlns:wne="http://schemas.microsoft.com/office/word/2006/wordml" xmlns:wp14="http://schemas.microsoft.com/office/word/2010/wordprocessingDrawing" xmlns:wp="http://schemas.openxmlformats.org/drawingml/2006/wordprocessingDrawing" xmlns:wpc="http://schemas.microsoft.com/office/word/2010/wordprocessingCanvas" xmlns:wpg="http://schemas.microsoft.com/office/word/2010/wordprocessingGroup" xmlns:wpi="http://schemas.microsoft.com/office/word/2010/wordprocessingInk" xmlns:wps="http://schemas.microsoft.com/office/word/2010/wordprocessingShape" mc:Ignorable="w14 wp14">
   <w:p>
     <w:pPr>
-      <w:pStyle w:val="Header"/>
+      <w:pStyle w:val="Footer"/>
       <w:jc w:val="center"/>
     </w:pPr>
     <w:r>
       <w:rPr>
         <w:rFonts w:ascii="Times New Roman" w:hAnsi="Times New Roman"/>
-        <w:sz w:val="24"/>
+        <w:sz w:val="20"/>
       </w:rPr>
       <w:fldChar w:fldCharType="begin"/>
       <w:instrText xml:space="preserve">PAGE</w:instrText>
       <w:fldChar w:fldCharType="end"/>
     </w:r>
   </w:p>
-</w:hdr>
+</w:ftr>
 </file>
 
 <file path=word/numbering.xml><?xml version="1.0" encoding="utf-8"?>
@@ -458,14 +445,15 @@
     <w:rsid w:val="00FC693F"/>
     <w:pPr>
       <w:keepNext w:val="0"/>
-      <w:spacing w:line="360" w:lineRule="auto" w:before="0" w:after="120"/>
-      <w:ind w:firstLine="283"/>
+      <w:spacing w:line="240" w:lineRule="auto" w:before="0" w:after="120"/>
+      <w:ind w:firstLine="0"/>
       <w:jc w:val="both"/>
     </w:pPr>
     <w:rPr>
       <w:b w:val="0"/>
+      <w:i w:val="0"/>
       <w:color w:val="000000"/>
-      <w:sz w:val="28"/>
+      <w:sz w:val="24"/>
       <w:rFonts w:ascii="Times New Roman" w:hAnsi="Times New Roman" w:cs="Times New Roman" w:eastAsia="Times New Roman"/>
     </w:rPr>
   </w:style>
@@ -524,7 +512,7 @@
     <w:pPr>
       <w:keepNext/>
       <w:keepLines/>
-      <w:spacing w:before="240" w:after="240" w:line="360" w:lineRule="auto"/>
+      <w:spacing w:before="240" w:after="240" w:line="240" w:lineRule="auto"/>
       <w:ind w:firstLine="0"/>
       <w:jc w:val="center"/>
       <w:outlineLvl w:val="0"/>
@@ -532,6 +520,7 @@
     <w:rPr>
       <w:b/>
       <w:bCs/>
+      <w:i w:val="0"/>
       <w:color w:val="000000"/>
       <w:sz w:val="28"/>
       <w:szCs w:val="28"/>
@@ -550,20 +539,19 @@
     <w:pPr>
       <w:keepNext/>
       <w:keepLines/>
-      <w:spacing w:before="360" w:after="120" w:line="360" w:lineRule="auto"/>
+      <w:spacing w:before="240" w:after="120" w:line="240" w:lineRule="auto"/>
       <w:ind w:firstLine="0"/>
-      <w:jc w:val="center"/>
+      <w:jc w:val="left"/>
       <w:outlineLvl w:val="1"/>
     </w:pPr>
     <w:rPr>
       <w:b/>
       <w:bCs/>
+      <w:i w:val="0"/>
       <w:color w:val="000000"/>
-      <w:sz w:val="28"/>
+      <w:sz w:val="24"/>
       <w:szCs w:val="26"/>
       <w:rFonts w:ascii="Times New Roman" w:hAnsi="Times New Roman" w:cs="Times New Roman" w:eastAsia="Times New Roman"/>
-      <w:spacing w:val="80"/>
-      <w:u w:val="single"/>
     </w:rPr>
   </w:style>
   <w:style w:type="paragraph" w:styleId="Heading3">
@@ -578,18 +566,18 @@
     <w:pPr>
       <w:keepNext/>
       <w:keepLines/>
-      <w:spacing w:before="240" w:after="120" w:line="360" w:lineRule="auto"/>
+      <w:spacing w:before="120" w:after="120" w:line="240" w:lineRule="auto"/>
       <w:ind w:firstLine="0"/>
-      <w:jc w:val="center"/>
+      <w:jc w:val="left"/>
       <w:outlineLvl w:val="2"/>
     </w:pPr>
     <w:rPr>
       <w:b/>
       <w:bCs/>
+      <w:i/>
       <w:color w:val="000000"/>
-      <w:sz w:val="28"/>
+      <w:sz w:val="24"/>
       <w:rFonts w:ascii="Times New Roman" w:hAnsi="Times New Roman" w:cs="Times New Roman" w:eastAsia="Times New Roman"/>
-      <w:u w:val="single"/>
     </w:rPr>
   </w:style>
   <w:style w:type="paragraph" w:styleId="Heading4">
@@ -605,20 +593,19 @@
     <w:pPr>
       <w:keepNext/>
       <w:keepLines/>
-      <w:spacing w:before="240" w:after="120" w:line="360" w:lineRule="auto"/>
+      <w:spacing w:before="120" w:after="120" w:line="240" w:lineRule="auto"/>
       <w:ind w:firstLine="0"/>
       <w:jc w:val="left"/>
       <w:outlineLvl w:val="3"/>
     </w:pPr>
     <w:rPr>
-      <w:b/>
+      <w:b w:val="0"/>
       <w:bCs/>
       <w:i/>
       <w:iCs/>
       <w:color w:val="000000"/>
-      <w:sz w:val="28"/>
+      <w:sz w:val="24"/>
       <w:rFonts w:ascii="Times New Roman" w:hAnsi="Times New Roman" w:cs="Times New Roman" w:eastAsia="Times New Roman"/>
-      <w:u w:val="single"/>
     </w:rPr>
   </w:style>
   <w:style w:type="paragraph" w:styleId="Heading5">
@@ -828,20 +815,20 @@
       <w:pBdr>
         <w:bottom w:val="single" w:sz="8" w:space="4" w:color="4F81BD" w:themeColor="accent1"/>
       </w:pBdr>
-      <w:spacing w:after="240" w:line="360" w:lineRule="auto" w:before="240"/>
+      <w:spacing w:after="240" w:line="240" w:lineRule="auto" w:before="0"/>
       <w:ind w:firstLine="0"/>
       <w:contextualSpacing/>
       <w:jc w:val="center"/>
     </w:pPr>
     <w:rPr>
       <w:b/>
+      <w:i w:val="0"/>
       <w:color w:val="000000"/>
       <w:spacing w:val="5"/>
       <w:kern w:val="28"/>
       <w:sz w:val="28"/>
       <w:szCs w:val="52"/>
       <w:rFonts w:ascii="Times New Roman" w:hAnsi="Times New Roman" w:cs="Times New Roman" w:eastAsia="Times New Roman"/>
-      <w:u w:val="single"/>
     </w:rPr>
   </w:style>
   <w:style w:type="character" w:customStyle="1" w:styleId="TitleChar">
@@ -905,18 +892,9 @@
     <w:qFormat/>
     <w:rsid w:val="00FC693F"/>
     <w:pPr>
-      <w:keepNext w:val="0"/>
-      <w:spacing w:line="360" w:lineRule="auto" w:before="0" w:after="120"/>
-      <w:ind w:left="720" w:firstLine="0"/>
+      <w:ind w:left="720"/>
       <w:contextualSpacing/>
-      <w:jc w:val="both"/>
-    </w:pPr>
-    <w:rPr>
-      <w:b w:val="0"/>
-      <w:color w:val="000000"/>
-      <w:sz w:val="28"/>
-      <w:rFonts w:ascii="Times New Roman" w:hAnsi="Times New Roman" w:cs="Times New Roman" w:eastAsia="Times New Roman"/>
-    </w:rPr>
+    </w:pPr>
   </w:style>
   <w:style w:type="paragraph" w:styleId="BodyText">
     <w:name w:val="Body Text"/>
@@ -926,17 +904,8 @@
     <w:unhideWhenUsed/>
     <w:rsid w:val="00AA1D8D"/>
     <w:pPr>
-      <w:keepNext w:val="0"/>
-      <w:spacing w:after="120" w:line="360" w:lineRule="auto" w:before="0"/>
-      <w:ind w:firstLine="283"/>
-      <w:jc w:val="both"/>
-    </w:pPr>
-    <w:rPr>
-      <w:b w:val="0"/>
-      <w:color w:val="000000"/>
-      <w:sz w:val="28"/>
-      <w:rFonts w:ascii="Times New Roman" w:hAnsi="Times New Roman" w:cs="Times New Roman" w:eastAsia="Times New Roman"/>
-    </w:rPr>
+      <w:spacing w:after="120"/>
+    </w:pPr>
   </w:style>
   <w:style w:type="character" w:customStyle="1" w:styleId="BodyTextChar">
     <w:name w:val="Body Text Char"/>

</xml_diff>